<commit_message>
Revision U06: SSH y LEDs, bug de default en R2, laboratorio reordenado y CEs alineados
</commit_message>
<xml_diff>
--- a/docx/06-enrutamiento-estatico/boletin-U06-avanzado-resuelto.docx
+++ b/docx/06-enrutamiento-estatico/boletin-U06-avanzado-resuelto.docx
@@ -1196,7 +1196,7 @@
           <w:b/>
           <w:bCs/>
         </w:rPr>
-        <w:t xml:space="preserve">Cuatro:</w:t>
+        <w:t xml:space="preserve">Tres:</w:t>
       </w:r>
       <w:r>
         <w:t xml:space="preserve"> </w:t>
@@ -1351,7 +1351,20 @@
         <w:t xml:space="preserve"> </w:t>
       </w:r>
       <w:r>
-        <w:t xml:space="preserve">la ruta estática se configura pero NO gana. En</w:t>
+        <w:t xml:space="preserve">la ruta estática se configura pero</w:t>
+      </w:r>
+      <w:r>
+        <w:t xml:space="preserve"> </w:t>
+      </w:r>
+      <w:r>
+        <w:rPr>
+          <w:b/>
+          <w:bCs/>
+        </w:rPr>
+        <w:t xml:space="preserve">no llega a instalarse</w:t>
+      </w:r>
+      <w:r>
+        <w:t xml:space="preserve">. En</w:t>
       </w:r>
       <w:r>
         <w:t xml:space="preserve"> </w:t>
@@ -1366,7 +1379,7 @@
         <w:t xml:space="preserve"> </w:t>
       </w:r>
       <w:r>
-        <w:t xml:space="preserve">verías ambas entradas: la</w:t>
+        <w:t xml:space="preserve">verías solo la</w:t>
       </w:r>
       <w:r>
         <w:t xml:space="preserve"> </w:t>
@@ -1381,22 +1394,7 @@
         <w:t xml:space="preserve"> </w:t>
       </w:r>
       <w:r>
-        <w:t xml:space="preserve">(conectada, AD 0) activa y la</w:t>
-      </w:r>
-      <w:r>
-        <w:t xml:space="preserve"> </w:t>
-      </w:r>
-      <w:r>
-        <w:rPr>
-          <w:rStyle w:val="VerbatimChar"/>
-        </w:rPr>
-        <w:t xml:space="preserve">S</w:t>
-      </w:r>
-      <w:r>
-        <w:t xml:space="preserve"> </w:t>
-      </w:r>
-      <w:r>
-        <w:t xml:space="preserve">(estática, AD 1) entre corchetes como alternativa menos fiable. El router siempre prefiere la de menor AD para el mismo prefijo, así que el encaminamiento local sigue funcionando. Eso sí: es una config descuidada — sobra y conviene quitarla con</w:t>
+        <w:t xml:space="preserve">(conectada, AD 0): con el mismo prefijo, la conectada gana a la estática (AD 1), así que el encaminamiento local sigue funcionando sin interferencias. Eso sí: es una config descuidada — sobra y conviene quitarla con</w:t>
       </w:r>
       <w:r>
         <w:t xml:space="preserve"> </w:t>

</xml_diff>